<commit_message>
add extensions schema to search_path for postgis types and explicitly create extension in extensions schema
</commit_message>
<xml_diff>
--- a/docs/UrbanAir_Intel_Submission.docx
+++ b/docs/UrbanAir_Intel_Submission.docx
@@ -70,14 +70,63 @@
         </w:rPr>
         <w:t xml:space="preserve">Prepared: 22 July 2026 · Primary demo city: Delhi NCR · Repository: </w:t>
       </w:r>
+      <w:hyperlink r:id="rId6" w:history="1">
+        <w:r>
+          <w:rPr>
+            <w:rStyle w:val="Hyperlink"/>
+            <w:rFonts w:ascii="Consolas" w:hAnsi="Consolas"/>
+            <w:i/>
+          </w:rPr>
+          <w:t>madhav-gfn/ETA</w:t>
+        </w:r>
+      </w:hyperlink>
       <w:r>
         <w:rPr>
           <w:rFonts w:ascii="Consolas" w:hAnsi="Consolas"/>
           <w:i/>
           <w:color w:val="8A2B2B"/>
         </w:rPr>
-        <w:t>madhav-gfn/ETA</w:t>
-      </w:r>
+        <w:t xml:space="preserve"> </w:t>
+      </w:r>
+      <w:r>
+        <w:rPr>
+          <w:i/>
+          <w:color w:val="595959"/>
+        </w:rPr>
+        <w:t xml:space="preserve">· </w:t>
+      </w:r>
+      <w:r>
+        <w:rPr>
+          <w:rFonts w:ascii="Consolas" w:hAnsi="Consolas"/>
+          <w:i/>
+          <w:color w:val="808080" w:themeColor="background1" w:themeShade="80"/>
+        </w:rPr>
+        <w:t>Deployment</w:t>
+      </w:r>
+      <w:r>
+        <w:rPr>
+          <w:rFonts w:ascii="Consolas" w:hAnsi="Consolas"/>
+          <w:i/>
+          <w:color w:val="808080" w:themeColor="background1" w:themeShade="80"/>
+        </w:rPr>
+        <w:t>:</w:t>
+      </w:r>
+      <w:r>
+        <w:rPr>
+          <w:i/>
+          <w:color w:val="595959"/>
+        </w:rPr>
+        <w:t xml:space="preserve"> </w:t>
+      </w:r>
+      <w:hyperlink r:id="rId7" w:history="1">
+        <w:r>
+          <w:rPr>
+            <w:rStyle w:val="Hyperlink"/>
+            <w:i/>
+          </w:rPr>
+          <w:t>https://eta-liard-nine.vercel.app/</w:t>
+        </w:r>
+      </w:hyperlink>
     </w:p>
     <w:p>
       <w:pPr>
@@ -1239,7 +1288,7 @@
         <w:t>Explicitly out of scope for this submission (see Section 37 for why, Section 38 for the upgrade path):</w:t>
       </w:r>
       <w:r>
-        <w:t xml:space="preserve"> Sentinel‑5P *raster* regridding (currently catalog‑level ingestion only; the NO2 channel is ground‑sensor‑proxy‑filled, flagged NaN where genuinely missing, never silently zero‑filled); physically‑grounded atmospheric dispersion modelling (Gaussian plume / CALPUFF‑class); construction‑permit and industrial‑registry ingestion; road‑network‑aware patrol routing (current routing is nearest‑neighbour over grid centroids, not an OSRM shortest path); SMS/IVR delivery of advisories; authentication/authorisation on any endpoint; production deployment (Render/Vercel targets are chosen and documented but not yet live).</w:t>
+        <w:t xml:space="preserve"> Sentinel‑5P *raster* regridding (currently catalog‑level ingestion only; the NO2 channel is ground‑sensor‑proxy‑filled, flagged NaN where genuinely missing, never silently zero‑filled); physically‑grounded atmospheric dispersion modelling (Gaussian plume / CALPUFF‑class); construction‑permit and industrial‑registry ingestion; road‑network‑aware patrol routing (current routing is nearest‑neighbour over grid centroids, not an OSRM shortest path); SMS/IVR delivery of advisories; authentication/authorisation on any endpoint; authentication/authorisation hardened for production use (current deployment at https://eta-liard-nine.vercel.app/ is a judged-prototype deployment, not a hardened one, see Section 27).</w:t>
       </w:r>
     </w:p>
     <w:p>
@@ -7960,7 +8009,7 @@
               <w:rPr>
                 <w:sz w:val="18"/>
               </w:rPr>
-              <w:t>Docker Compose (Postgres + Redis today; Render target for backend, Vercel target for frontend)</w:t>
+              <w:t>Docker Compose for local dev; live at https://eta-liard-nine.vercel.app/ on Railway (backend), Supabase (Postgres+PostGIS), Upstash (Redis), and Vercel (frontend), see docs/DEPLOY.md</w:t>
             </w:r>
           </w:p>
         </w:tc>
@@ -8171,25 +8220,98 @@
     </w:p>
     <w:p>
       <w:r>
-        <w:t xml:space="preserve">Target (documented, not yet live — Step 8 of the build plan, Section 39): backend + PostGIS + Redis to </w:t>
+        <w:t xml:space="preserve">Live (Step 8 of the build plan, Section 39, complete): frontend on </w:t>
       </w:r>
       <w:r>
         <w:rPr>
           <w:b/>
         </w:rPr>
-        <w:t>Render</w:t>
-      </w:r>
-      <w:r>
-        <w:t xml:space="preserve">, whose service model Docker Compose translates to directly; frontend to </w:t>
+        <w:t>Vercel</w:t>
+      </w:r>
+      <w:r>
+        <w:t xml:space="preserve"> at </w:t>
+      </w:r>
+      <w:r>
+        <w:rPr>
+          <w:rFonts w:ascii="Consolas" w:hAnsi="Consolas"/>
+          <w:color w:val="8A2B2B"/>
+          <w:sz w:val="19"/>
+        </w:rPr>
+        <w:t>https://eta-liard-nine.vercel.app/</w:t>
+      </w:r>
+      <w:r>
+        <w:t xml:space="preserve">; backend on </w:t>
       </w:r>
       <w:r>
         <w:rPr>
           <w:b/>
         </w:rPr>
-        <w:t>Vercel</w:t>
-      </w:r>
-      <w:r>
-        <w:t xml:space="preserve">. Environment variables map 1:1 from </w:t>
+        <w:t>Railway</w:t>
+      </w:r>
+      <w:r>
+        <w:t xml:space="preserve"> (Docker, port 8000); Postgres+PostGIS on </w:t>
+      </w:r>
+      <w:r>
+        <w:rPr>
+          <w:b/>
+        </w:rPr>
+        <w:t>Supabase</w:t>
+      </w:r>
+      <w:r>
+        <w:t xml:space="preserve"> (session-pooler connection, free tier); Redis on </w:t>
+      </w:r>
+      <w:r>
+        <w:rPr>
+          <w:b/>
+        </w:rPr>
+        <w:t>Upstash</w:t>
+      </w:r>
+      <w:r>
+        <w:t xml:space="preserve"> (TLS, fail-open, the cache layer degrades to no-caching rather than erroring if briefly unreachable). No backend code changes were needed to move from Docker Compose to this stack (</w:t>
+      </w:r>
+      <w:r>
+        <w:rPr>
+          <w:rFonts w:ascii="Consolas" w:hAnsi="Consolas"/>
+          <w:color w:val="8A2B2B"/>
+          <w:sz w:val="19"/>
+        </w:rPr>
+        <w:t>DATABASE_URL</w:t>
+      </w:r>
+      <w:r>
+        <w:t xml:space="preserve">/</w:t>
+      </w:r>
+      <w:r>
+        <w:rPr>
+          <w:rFonts w:ascii="Consolas" w:hAnsi="Consolas"/>
+          <w:color w:val="8A2B2B"/>
+          <w:sz w:val="19"/>
+        </w:rPr>
+        <w:t>REDIS_URL</w:t>
+      </w:r>
+      <w:r>
+        <w:t xml:space="preserve"> are read from </w:t>
+      </w:r>
+      <w:r>
+        <w:rPr>
+          <w:rFonts w:ascii="Consolas" w:hAnsi="Consolas"/>
+          <w:color w:val="8A2B2B"/>
+          <w:sz w:val="19"/>
+        </w:rPr>
+        <w:t>app/core/config.py</w:t>
+      </w:r>
+      <w:r>
+        <w:t xml:space="preserve">). Full step-by-step deploy instructions, cost notes, and the free-tier gotchas (the Supabase free-tier 7-day auto-pause on zero DB activity, the session-pooler-vs-transaction-pooler port distinction) are in </w:t>
+      </w:r>
+      <w:r>
+        <w:rPr>
+          <w:rFonts w:ascii="Consolas" w:hAnsi="Consolas"/>
+          <w:color w:val="8A2B2B"/>
+          <w:sz w:val="19"/>
+        </w:rPr>
+        <w:t>docs/DEPLOY.md</w:t>
+      </w:r>
+      <w:r>
+        <w:t xml:space="preserve">. Environment variables still map 1:1 from </w:t>
       </w:r>
       <w:r>
         <w:rPr>
@@ -9871,10 +9993,10 @@
         <w:rPr>
           <w:b/>
         </w:rPr>
-        <w:t>Deployment</w:t>
-      </w:r>
-      <w:r>
-        <w:t xml:space="preserve"> — Render (backend/DB/Redis) + Vercel (frontend), per Section 29.</w:t>
+        <w:t>Production hardening of the now-live deployment</w:t>
+      </w:r>
+      <w:r>
+        <w:t xml:space="preserve"> (Section 29), authentication and rate limiting ahead of any real administrative use, per Section 27.</w:t>
       </w:r>
     </w:p>
     <w:p>
@@ -10551,13 +10673,13 @@
                 <w:rFonts w:ascii="Segoe UI Emoji" w:hAnsi="Segoe UI Emoji" w:cs="Segoe UI Emoji"/>
                 <w:sz w:val="18"/>
               </w:rPr>
-              <w:t>🔨</w:t>
-            </w:r>
-            <w:r>
-              <w:rPr>
-                <w:sz w:val="18"/>
-              </w:rPr>
-              <w:t xml:space="preserve"> In progress — architecture/demo docs written, deployment pending</w:t>
+              <w:t>✅</w:t>
+            </w:r>
+            <w:r>
+              <w:rPr>
+                <w:sz w:val="18"/>
+              </w:rPr>
+              <w:t xml:space="preserve"> Done, live at https://eta-liard-nine.vercel.app/ (Section 29)</w:t>
             </w:r>
           </w:p>
         </w:tc>
@@ -11589,19 +11711,19 @@
         <w:rPr>
           <w:b/>
         </w:rPr>
-        <w:t>Rough production‑scale figure:</w:t>
-      </w:r>
-      <w:r>
-        <w:t xml:space="preserve"> on the order of </w:t>
+        <w:t>Actual live-deployment figure (Section 29):</w:t>
+      </w:r>
+      <w:r>
+        <w:t xml:space="preserve"> Vercel frontend hosting and the Supabase/Upstash free tiers cost nothing at this traffic; </w:t>
       </w:r>
       <w:r>
         <w:rPr>
           <w:b/>
         </w:rPr>
-        <w:t>a few tens of USD per month per city</w:t>
-      </w:r>
-      <w:r>
-        <w:t xml:space="preserve"> to run a small managed Postgres/PostGIS instance and a backend web service on a platform like Render, with frontend hosting (Vercel) and LLM API usage adding negligibly more at this scale. Each additional city adds ingestion/training compute time, not new data‑licensing cost, since every source is free at any bounding box (Section 28).</w:t>
+        <w:t>Railway backend compute is the only metered cost, on the order of a few USD per month</w:t>
+      </w:r>
+      <w:r>
+        <w:t xml:space="preserve"> for a single always-on container, with LLM API usage adding negligibly more at this scale. Each additional city adds ingestion/training compute time, not new data‑licensing cost, since every source is free at any bounding box (Section 28).</w:t>
       </w:r>
     </w:p>
     <w:p>
@@ -24549,6 +24671,29 @@
       </w:tcPr>
     </w:tblStylePr>
   </w:style>
+  <w:style w:type="character" w:styleId="Hyperlink">
+    <w:name w:val="Hyperlink"/>
+    <w:basedOn w:val="DefaultParagraphFont"/>
+    <w:uiPriority w:val="99"/>
+    <w:unhideWhenUsed/>
+    <w:rsid w:val="007004A9"/>
+    <w:rPr>
+      <w:color w:val="0000FF" w:themeColor="hyperlink"/>
+      <w:u w:val="single"/>
+    </w:rPr>
+  </w:style>
+  <w:style w:type="character" w:styleId="UnresolvedMention">
+    <w:name w:val="Unresolved Mention"/>
+    <w:basedOn w:val="DefaultParagraphFont"/>
+    <w:uiPriority w:val="99"/>
+    <w:semiHidden/>
+    <w:unhideWhenUsed/>
+    <w:rsid w:val="007004A9"/>
+    <w:rPr>
+      <w:color w:val="605E5C"/>
+      <w:shd w:val="clear" w:color="auto" w:fill="E1DFDD"/>
+    </w:rPr>
+  </w:style>
 </w:styles>
 </file>
 

</xml_diff>